<commit_message>
se termina plantilla contrato
</commit_message>
<xml_diff>
--- a/storage/plantillas/contrato.docx
+++ b/storage/plantillas/contrato.docx
@@ -5,6 +5,7 @@
     <w:p>
       <w:pPr>
         <w:spacing w:after="0" w:line="240" w:lineRule="auto"/>
+        <w:ind w:left="2124" w:hanging="2124"/>
         <w:jc w:val="center"/>
         <w:rPr>
           <w:rFonts w:ascii="Arial Narrow" w:eastAsia="Times New Roman" w:hAnsi="Arial Narrow" w:cs="Arial"/>
@@ -18,7 +19,15 @@
           <w:b/>
           <w:lang w:val="es-ES" w:eastAsia="es-ES"/>
         </w:rPr>
-        <w:t>CONTRATO DE OBRA CIVIL N.º {{</w:t>
+        <w:t xml:space="preserve">CONTRATO DE OBRA CIVIL N.º </w:t>
+      </w:r>
+      <w:r>
+        <w:rPr>
+          <w:rFonts w:ascii="Arial Narrow" w:eastAsia="Times New Roman" w:hAnsi="Arial Narrow" w:cs="Arial"/>
+          <w:b/>
+          <w:lang w:val="es-ES" w:eastAsia="es-ES"/>
+        </w:rPr>
+        <w:t>${</w:t>
       </w:r>
       <w:proofErr w:type="spellStart"/>
       <w:r>
@@ -36,7 +45,23 @@
           <w:b/>
           <w:lang w:val="es-ES" w:eastAsia="es-ES"/>
         </w:rPr>
-        <w:t>}} DEL {{</w:t>
+        <w:t>}</w:t>
+      </w:r>
+      <w:r>
+        <w:rPr>
+          <w:rFonts w:ascii="Arial Narrow" w:eastAsia="Times New Roman" w:hAnsi="Arial Narrow" w:cs="Arial"/>
+          <w:b/>
+          <w:lang w:val="es-ES" w:eastAsia="es-ES"/>
+        </w:rPr>
+        <w:t xml:space="preserve"> DEL </w:t>
+      </w:r>
+      <w:r>
+        <w:rPr>
+          <w:rFonts w:ascii="Arial Narrow" w:eastAsia="Times New Roman" w:hAnsi="Arial Narrow" w:cs="Arial"/>
+          <w:b/>
+          <w:lang w:val="es-ES" w:eastAsia="es-ES"/>
+        </w:rPr>
+        <w:t>${</w:t>
       </w:r>
       <w:proofErr w:type="spellStart"/>
       <w:r>
@@ -54,7 +79,7 @@
           <w:b/>
           <w:lang w:val="es-ES" w:eastAsia="es-ES"/>
         </w:rPr>
-        <w:t>}}</w:t>
+        <w:t>}</w:t>
       </w:r>
     </w:p>
     <w:p>
@@ -91,7 +116,7 @@
           <w:rFonts w:ascii="Arial Narrow" w:hAnsi="Arial Narrow"/>
           <w:b/>
         </w:rPr>
-        <w:t>{{</w:t>
+        <w:t>${</w:t>
       </w:r>
       <w:proofErr w:type="spellStart"/>
       <w:r>
@@ -107,14 +132,28 @@
           <w:rFonts w:ascii="Arial Narrow" w:hAnsi="Arial Narrow"/>
           <w:b/>
         </w:rPr>
-        <w:t xml:space="preserve">}} </w:t>
-      </w:r>
-      <w:r>
-        <w:rPr>
-          <w:rFonts w:ascii="Arial Narrow" w:eastAsia="Times New Roman" w:hAnsi="Arial Narrow" w:cs="Arial"/>
-          <w:lang w:val="es-ES" w:eastAsia="es-ES"/>
-        </w:rPr>
-        <w:t>mayor de edad, domiciliado con {{</w:t>
+        <w:t>}</w:t>
+      </w:r>
+      <w:r>
+        <w:rPr>
+          <w:rFonts w:ascii="Arial Narrow" w:hAnsi="Arial Narrow"/>
+          <w:b/>
+        </w:rPr>
+        <w:t xml:space="preserve"> </w:t>
+      </w:r>
+      <w:r>
+        <w:rPr>
+          <w:rFonts w:ascii="Arial Narrow" w:eastAsia="Times New Roman" w:hAnsi="Arial Narrow" w:cs="Arial"/>
+          <w:lang w:val="es-ES" w:eastAsia="es-ES"/>
+        </w:rPr>
+        <w:t xml:space="preserve">mayor de edad, domiciliado con </w:t>
+      </w:r>
+      <w:r>
+        <w:rPr>
+          <w:rFonts w:ascii="Arial Narrow" w:eastAsia="Times New Roman" w:hAnsi="Arial Narrow" w:cs="Arial"/>
+          <w:lang w:val="es-ES" w:eastAsia="es-ES"/>
+        </w:rPr>
+        <w:t>${</w:t>
       </w:r>
       <w:proofErr w:type="spellStart"/>
       <w:r>
@@ -130,7 +169,21 @@
           <w:rFonts w:ascii="Arial Narrow" w:eastAsia="Times New Roman" w:hAnsi="Arial Narrow" w:cs="Arial"/>
           <w:lang w:val="es-ES" w:eastAsia="es-ES"/>
         </w:rPr>
-        <w:t>}}, identificado con {{</w:t>
+        <w:t>}</w:t>
+      </w:r>
+      <w:r>
+        <w:rPr>
+          <w:rFonts w:ascii="Arial Narrow" w:eastAsia="Times New Roman" w:hAnsi="Arial Narrow" w:cs="Arial"/>
+          <w:lang w:val="es-ES" w:eastAsia="es-ES"/>
+        </w:rPr>
+        <w:t xml:space="preserve">, identificado con </w:t>
+      </w:r>
+      <w:r>
+        <w:rPr>
+          <w:rFonts w:ascii="Arial Narrow" w:eastAsia="Times New Roman" w:hAnsi="Arial Narrow" w:cs="Arial"/>
+          <w:lang w:val="es-ES" w:eastAsia="es-ES"/>
+        </w:rPr>
+        <w:t>${</w:t>
       </w:r>
       <w:proofErr w:type="spellStart"/>
       <w:r>
@@ -146,7 +199,14 @@
           <w:rFonts w:ascii="Arial Narrow" w:eastAsia="Times New Roman" w:hAnsi="Arial Narrow" w:cs="Arial"/>
           <w:lang w:val="es-ES" w:eastAsia="es-ES"/>
         </w:rPr>
-        <w:t xml:space="preserve">}} </w:t>
+        <w:t>}</w:t>
+      </w:r>
+      <w:r>
+        <w:rPr>
+          <w:rFonts w:ascii="Arial Narrow" w:eastAsia="Times New Roman" w:hAnsi="Arial Narrow" w:cs="Arial"/>
+          <w:lang w:val="es-ES" w:eastAsia="es-ES"/>
+        </w:rPr>
+        <w:t xml:space="preserve"> </w:t>
       </w:r>
       <w:proofErr w:type="spellStart"/>
       <w:r>
@@ -170,7 +230,7 @@
           <w:b/>
           <w:lang w:val="es-ES_tradnl"/>
         </w:rPr>
-        <w:t>{{</w:t>
+        <w:t>${</w:t>
       </w:r>
       <w:proofErr w:type="spellStart"/>
       <w:r>
@@ -188,7 +248,7 @@
           <w:b/>
           <w:lang w:val="es-ES_tradnl"/>
         </w:rPr>
-        <w:t>}}</w:t>
+        <w:t>}</w:t>
       </w:r>
       <w:r>
         <w:rPr>
@@ -220,7 +280,7 @@
           <w:bCs/>
           <w:lang w:val="es-ES" w:eastAsia="es-ES"/>
         </w:rPr>
-        <w:t>{{</w:t>
+        <w:t>${</w:t>
       </w:r>
       <w:proofErr w:type="spellStart"/>
       <w:r>
@@ -240,14 +300,21 @@
           <w:bCs/>
           <w:lang w:val="es-ES" w:eastAsia="es-ES"/>
         </w:rPr>
-        <w:t>}}</w:t>
-      </w:r>
-      <w:r>
-        <w:rPr>
-          <w:rFonts w:ascii="Arial Narrow" w:eastAsia="Times New Roman" w:hAnsi="Arial Narrow" w:cs="Arial"/>
-          <w:lang w:val="es-ES" w:eastAsia="es-ES"/>
-        </w:rPr>
-        <w:t>, mayor de edad, domiciliado en Cali, Valle identificado con {{</w:t>
+        <w:t>}</w:t>
+      </w:r>
+      <w:r>
+        <w:rPr>
+          <w:rFonts w:ascii="Arial Narrow" w:eastAsia="Times New Roman" w:hAnsi="Arial Narrow" w:cs="Arial"/>
+          <w:lang w:val="es-ES" w:eastAsia="es-ES"/>
+        </w:rPr>
+        <w:t xml:space="preserve">, mayor de edad, domiciliado en Cali, Valle identificado con </w:t>
+      </w:r>
+      <w:r>
+        <w:rPr>
+          <w:rFonts w:ascii="Arial Narrow" w:eastAsia="Times New Roman" w:hAnsi="Arial Narrow" w:cs="Arial"/>
+          <w:lang w:val="es-ES" w:eastAsia="es-ES"/>
+        </w:rPr>
+        <w:t>${</w:t>
       </w:r>
       <w:proofErr w:type="spellStart"/>
       <w:r>
@@ -263,7 +330,14 @@
           <w:rFonts w:ascii="Arial Narrow" w:eastAsia="Times New Roman" w:hAnsi="Arial Narrow" w:cs="Arial"/>
           <w:lang w:val="es-ES" w:eastAsia="es-ES"/>
         </w:rPr>
-        <w:t xml:space="preserve">}} </w:t>
+        <w:t>}</w:t>
+      </w:r>
+      <w:r>
+        <w:rPr>
+          <w:rFonts w:ascii="Arial Narrow" w:eastAsia="Times New Roman" w:hAnsi="Arial Narrow" w:cs="Arial"/>
+          <w:lang w:val="es-ES" w:eastAsia="es-ES"/>
+        </w:rPr>
+        <w:t xml:space="preserve"> </w:t>
       </w:r>
       <w:proofErr w:type="spellStart"/>
       <w:r>
@@ -281,7 +355,7 @@
           <w:bCs/>
           <w:lang w:val="es-ES" w:eastAsia="es-ES"/>
         </w:rPr>
-        <w:t>{{</w:t>
+        <w:t>${</w:t>
       </w:r>
       <w:proofErr w:type="spellStart"/>
       <w:r>
@@ -301,7 +375,7 @@
           <w:bCs/>
           <w:lang w:val="es-ES" w:eastAsia="es-ES"/>
         </w:rPr>
-        <w:t>}}</w:t>
+        <w:t>}</w:t>
       </w:r>
       <w:r>
         <w:rPr>
@@ -315,7 +389,14 @@
           <w:rFonts w:ascii="Arial Narrow" w:eastAsia="Times New Roman" w:hAnsi="Arial Narrow" w:cs="Arial"/>
           <w:lang w:val="es-ES" w:eastAsia="es-ES"/>
         </w:rPr>
-        <w:t>expedida en {{</w:t>
+        <w:t xml:space="preserve">expedida en </w:t>
+      </w:r>
+      <w:r>
+        <w:rPr>
+          <w:rFonts w:ascii="Arial Narrow" w:eastAsia="Times New Roman" w:hAnsi="Arial Narrow" w:cs="Arial"/>
+          <w:lang w:val="es-ES" w:eastAsia="es-ES"/>
+        </w:rPr>
+        <w:t>${</w:t>
       </w:r>
       <w:proofErr w:type="spellStart"/>
       <w:r>
@@ -331,7 +412,14 @@
           <w:rFonts w:ascii="Arial Narrow" w:eastAsia="Times New Roman" w:hAnsi="Arial Narrow" w:cs="Arial"/>
           <w:lang w:val="es-ES" w:eastAsia="es-ES"/>
         </w:rPr>
-        <w:t xml:space="preserve">}}, actuando en representación legal de la empresa </w:t>
+        <w:t>}</w:t>
+      </w:r>
+      <w:r>
+        <w:rPr>
+          <w:rFonts w:ascii="Arial Narrow" w:eastAsia="Times New Roman" w:hAnsi="Arial Narrow" w:cs="Arial"/>
+          <w:lang w:val="es-ES" w:eastAsia="es-ES"/>
+        </w:rPr>
+        <w:t xml:space="preserve">, actuando en representación legal de la empresa </w:t>
       </w:r>
       <w:r>
         <w:rPr>
@@ -340,7 +428,7 @@
           <w:bCs/>
           <w:lang w:val="es-ES" w:eastAsia="es-ES"/>
         </w:rPr>
-        <w:t>{{</w:t>
+        <w:t>${</w:t>
       </w:r>
       <w:proofErr w:type="spellStart"/>
       <w:r>
@@ -360,14 +448,30 @@
           <w:bCs/>
           <w:lang w:val="es-ES" w:eastAsia="es-ES"/>
         </w:rPr>
-        <w:t xml:space="preserve">}} </w:t>
-      </w:r>
-      <w:r>
-        <w:rPr>
-          <w:rFonts w:ascii="Arial Narrow" w:eastAsia="Times New Roman" w:hAnsi="Arial Narrow" w:cs="Arial"/>
-          <w:lang w:val="es-ES" w:eastAsia="es-ES"/>
-        </w:rPr>
-        <w:t>persona jurídica inscrita en cámara de comercio de {{</w:t>
+        <w:t>}</w:t>
+      </w:r>
+      <w:r>
+        <w:rPr>
+          <w:rFonts w:ascii="Arial Narrow" w:eastAsia="Times New Roman" w:hAnsi="Arial Narrow" w:cs="Arial"/>
+          <w:b/>
+          <w:bCs/>
+          <w:lang w:val="es-ES" w:eastAsia="es-ES"/>
+        </w:rPr>
+        <w:t xml:space="preserve"> </w:t>
+      </w:r>
+      <w:r>
+        <w:rPr>
+          <w:rFonts w:ascii="Arial Narrow" w:eastAsia="Times New Roman" w:hAnsi="Arial Narrow" w:cs="Arial"/>
+          <w:lang w:val="es-ES" w:eastAsia="es-ES"/>
+        </w:rPr>
+        <w:t xml:space="preserve">persona jurídica inscrita en cámara de comercio de </w:t>
+      </w:r>
+      <w:r>
+        <w:rPr>
+          <w:rFonts w:ascii="Arial Narrow" w:eastAsia="Times New Roman" w:hAnsi="Arial Narrow" w:cs="Arial"/>
+          <w:lang w:val="es-ES" w:eastAsia="es-ES"/>
+        </w:rPr>
+        <w:t>${</w:t>
       </w:r>
       <w:proofErr w:type="spellStart"/>
       <w:r>
@@ -383,7 +487,14 @@
           <w:rFonts w:ascii="Arial Narrow" w:eastAsia="Times New Roman" w:hAnsi="Arial Narrow" w:cs="Arial"/>
           <w:lang w:val="es-ES" w:eastAsia="es-ES"/>
         </w:rPr>
-        <w:t xml:space="preserve">}}, con NIT </w:t>
+        <w:t>}</w:t>
+      </w:r>
+      <w:r>
+        <w:rPr>
+          <w:rFonts w:ascii="Arial Narrow" w:eastAsia="Times New Roman" w:hAnsi="Arial Narrow" w:cs="Arial"/>
+          <w:lang w:val="es-ES" w:eastAsia="es-ES"/>
+        </w:rPr>
+        <w:t xml:space="preserve">, con NIT </w:t>
       </w:r>
       <w:proofErr w:type="spellStart"/>
       <w:r>
@@ -399,7 +510,7 @@
           <w:rFonts w:ascii="Arial Narrow" w:eastAsia="Times New Roman" w:hAnsi="Arial Narrow" w:cs="Arial"/>
           <w:lang w:val="es-ES" w:eastAsia="es-ES"/>
         </w:rPr>
-        <w:t>{{</w:t>
+        <w:t>${</w:t>
       </w:r>
       <w:proofErr w:type="spellStart"/>
       <w:r>
@@ -415,7 +526,14 @@
           <w:rFonts w:ascii="Arial Narrow" w:eastAsia="Times New Roman" w:hAnsi="Arial Narrow" w:cs="Arial"/>
           <w:lang w:val="es-ES" w:eastAsia="es-ES"/>
         </w:rPr>
-        <w:t xml:space="preserve">}}  quien para efectos del presente contrato se llamará </w:t>
+        <w:t>}</w:t>
+      </w:r>
+      <w:r>
+        <w:rPr>
+          <w:rFonts w:ascii="Arial Narrow" w:eastAsia="Times New Roman" w:hAnsi="Arial Narrow" w:cs="Arial"/>
+          <w:lang w:val="es-ES" w:eastAsia="es-ES"/>
+        </w:rPr>
+        <w:t xml:space="preserve">  quien para efectos del presente contrato se llamará </w:t>
       </w:r>
       <w:r>
         <w:rPr>
@@ -488,7 +606,7 @@
           <w:u w:val="single"/>
           <w:lang w:val="es-ES" w:eastAsia="es-ES"/>
         </w:rPr>
-        <w:t>{{</w:t>
+        <w:t>${</w:t>
       </w:r>
       <w:proofErr w:type="spellStart"/>
       <w:r>
@@ -508,7 +626,25 @@
           <w:u w:val="single"/>
           <w:lang w:val="es-ES" w:eastAsia="es-ES"/>
         </w:rPr>
-        <w:t>}} - {{</w:t>
+        <w:t>}</w:t>
+      </w:r>
+      <w:r>
+        <w:rPr>
+          <w:rFonts w:ascii="Arial Narrow" w:eastAsia="Times New Roman" w:hAnsi="Arial Narrow" w:cs="Arial"/>
+          <w:b/>
+          <w:u w:val="single"/>
+          <w:lang w:val="es-ES" w:eastAsia="es-ES"/>
+        </w:rPr>
+        <w:t xml:space="preserve"> - </w:t>
+      </w:r>
+      <w:r>
+        <w:rPr>
+          <w:rFonts w:ascii="Arial Narrow" w:eastAsia="Times New Roman" w:hAnsi="Arial Narrow" w:cs="Arial"/>
+          <w:b/>
+          <w:u w:val="single"/>
+          <w:lang w:val="es-ES" w:eastAsia="es-ES"/>
+        </w:rPr>
+        <w:t>${</w:t>
       </w:r>
       <w:proofErr w:type="spellStart"/>
       <w:r>
@@ -528,7 +664,25 @@
           <w:u w:val="single"/>
           <w:lang w:val="es-ES" w:eastAsia="es-ES"/>
         </w:rPr>
-        <w:t>}} área privada {{</w:t>
+        <w:t>}</w:t>
+      </w:r>
+      <w:r>
+        <w:rPr>
+          <w:rFonts w:ascii="Arial Narrow" w:eastAsia="Times New Roman" w:hAnsi="Arial Narrow" w:cs="Arial"/>
+          <w:b/>
+          <w:u w:val="single"/>
+          <w:lang w:val="es-ES" w:eastAsia="es-ES"/>
+        </w:rPr>
+        <w:t xml:space="preserve"> área privada </w:t>
+      </w:r>
+      <w:r>
+        <w:rPr>
+          <w:rFonts w:ascii="Arial Narrow" w:eastAsia="Times New Roman" w:hAnsi="Arial Narrow" w:cs="Arial"/>
+          <w:b/>
+          <w:u w:val="single"/>
+          <w:lang w:val="es-ES" w:eastAsia="es-ES"/>
+        </w:rPr>
+        <w:t>${</w:t>
       </w:r>
       <w:proofErr w:type="spellStart"/>
       <w:r>
@@ -548,7 +702,16 @@
           <w:u w:val="single"/>
           <w:lang w:val="es-ES" w:eastAsia="es-ES"/>
         </w:rPr>
-        <w:t>}} Mt</w:t>
+        <w:t>}</w:t>
+      </w:r>
+      <w:r>
+        <w:rPr>
+          <w:rFonts w:ascii="Arial Narrow" w:eastAsia="Times New Roman" w:hAnsi="Arial Narrow" w:cs="Arial"/>
+          <w:b/>
+          <w:u w:val="single"/>
+          <w:lang w:val="es-ES" w:eastAsia="es-ES"/>
+        </w:rPr>
+        <w:t xml:space="preserve"> Mt</w:t>
       </w:r>
       <w:r>
         <w:rPr>
@@ -580,127 +743,6 @@
         <w:t>conforme las características que se detallan a continuación.</w:t>
       </w:r>
     </w:p>
-    <w:tbl>
-      <w:tblPr>
-        <w:tblW w:w="5000" w:type="pct"/>
-        <w:tblInd w:w="55" w:type="dxa"/>
-        <w:tblLayout w:type="fixed"/>
-        <w:tblCellMar>
-          <w:top w:w="55" w:type="dxa"/>
-          <w:left w:w="55" w:type="dxa"/>
-          <w:bottom w:w="55" w:type="dxa"/>
-          <w:right w:w="55" w:type="dxa"/>
-        </w:tblCellMar>
-        <w:tblLook w:val="04A0" w:firstRow="1" w:lastRow="0" w:firstColumn="1" w:lastColumn="0" w:noHBand="0" w:noVBand="1"/>
-      </w:tblPr>
-      <w:tblGrid>
-        <w:gridCol w:w="5387"/>
-        <w:gridCol w:w="1984"/>
-        <w:gridCol w:w="1577"/>
-      </w:tblGrid>
-      <w:tr>
-        <w:trPr>
-          <w:trHeight w:val="305"/>
-        </w:trPr>
-        <w:tc>
-          <w:tcPr>
-            <w:tcW w:w="5387" w:type="dxa"/>
-            <w:tcBorders>
-              <w:top w:val="single" w:sz="4" w:space="0" w:color="000000"/>
-              <w:left w:val="single" w:sz="4" w:space="0" w:color="000000"/>
-              <w:bottom w:val="single" w:sz="4" w:space="0" w:color="000000"/>
-            </w:tcBorders>
-            <w:shd w:val="clear" w:color="auto" w:fill="ED7D31" w:themeFill="accent2"/>
-          </w:tcPr>
-          <w:p>
-            <w:pPr>
-              <w:spacing w:line="240" w:lineRule="auto"/>
-              <w:jc w:val="center"/>
-              <w:rPr>
-                <w:b/>
-                <w:bCs/>
-                <w:szCs w:val="24"/>
-              </w:rPr>
-            </w:pPr>
-            <w:r>
-              <w:rPr>
-                <w:rFonts w:ascii="ArialNarrow-Bold" w:hAnsi="ArialNarrow-Bold"/>
-                <w:b/>
-                <w:bCs/>
-                <w:color w:val="FFFFFF"/>
-                <w:szCs w:val="24"/>
-              </w:rPr>
-              <w:t>Entregables</w:t>
-            </w:r>
-          </w:p>
-        </w:tc>
-        <w:tc>
-          <w:tcPr>
-            <w:tcW w:w="1984" w:type="dxa"/>
-            <w:tcBorders>
-              <w:top w:val="single" w:sz="4" w:space="0" w:color="000000"/>
-              <w:left w:val="single" w:sz="4" w:space="0" w:color="000000"/>
-              <w:bottom w:val="single" w:sz="4" w:space="0" w:color="000000"/>
-            </w:tcBorders>
-            <w:shd w:val="clear" w:color="auto" w:fill="ED7D31" w:themeFill="accent2"/>
-          </w:tcPr>
-          <w:p>
-            <w:pPr>
-              <w:spacing w:line="240" w:lineRule="auto"/>
-              <w:jc w:val="center"/>
-              <w:rPr>
-                <w:b/>
-                <w:bCs/>
-                <w:szCs w:val="24"/>
-              </w:rPr>
-            </w:pPr>
-            <w:r>
-              <w:rPr>
-                <w:rFonts w:ascii="ArialNarrow-Bold" w:hAnsi="ArialNarrow-Bold"/>
-                <w:b/>
-                <w:bCs/>
-                <w:color w:val="FFFFFF"/>
-                <w:szCs w:val="24"/>
-              </w:rPr>
-              <w:t>Precios</w:t>
-            </w:r>
-          </w:p>
-        </w:tc>
-        <w:tc>
-          <w:tcPr>
-            <w:tcW w:w="1577" w:type="dxa"/>
-            <w:tcBorders>
-              <w:top w:val="single" w:sz="4" w:space="0" w:color="000000"/>
-              <w:left w:val="single" w:sz="4" w:space="0" w:color="000000"/>
-              <w:bottom w:val="single" w:sz="4" w:space="0" w:color="000000"/>
-              <w:right w:val="single" w:sz="4" w:space="0" w:color="000000"/>
-            </w:tcBorders>
-            <w:shd w:val="clear" w:color="auto" w:fill="ED7D31" w:themeFill="accent2"/>
-          </w:tcPr>
-          <w:p>
-            <w:pPr>
-              <w:spacing w:line="240" w:lineRule="auto"/>
-              <w:jc w:val="center"/>
-              <w:rPr>
-                <w:b/>
-                <w:bCs/>
-                <w:szCs w:val="24"/>
-              </w:rPr>
-            </w:pPr>
-            <w:r>
-              <w:rPr>
-                <w:rFonts w:ascii="ArialNarrow-Bold" w:hAnsi="ArialNarrow-Bold"/>
-                <w:b/>
-                <w:bCs/>
-                <w:color w:val="FFFFFF"/>
-                <w:szCs w:val="24"/>
-              </w:rPr>
-              <w:t>Tiempos</w:t>
-            </w:r>
-          </w:p>
-        </w:tc>
-      </w:tr>
-    </w:tbl>
     <w:p>
       <w:pPr>
         <w:jc w:val="both"/>
@@ -708,6 +750,32 @@
           <w:u w:val="single"/>
         </w:rPr>
       </w:pPr>
+      <w:r>
+        <w:rPr>
+          <w:u w:val="single"/>
+        </w:rPr>
+        <w:t xml:space="preserve"> </w:t>
+      </w:r>
+      <w:r>
+        <w:rPr>
+          <w:u w:val="single"/>
+        </w:rPr>
+        <w:t>${</w:t>
+      </w:r>
+      <w:proofErr w:type="spellStart"/>
+      <w:r>
+        <w:rPr>
+          <w:u w:val="single"/>
+        </w:rPr>
+        <w:t>table_entregables</w:t>
+      </w:r>
+      <w:proofErr w:type="spellEnd"/>
+      <w:r>
+        <w:rPr>
+          <w:u w:val="single"/>
+        </w:rPr>
+        <w:t>}</w:t>
+      </w:r>
     </w:p>
     <w:p>
       <w:pPr>
@@ -739,7 +807,14 @@
           <w:rFonts w:ascii="Arial Narrow" w:eastAsia="Times New Roman" w:hAnsi="Arial Narrow" w:cs="Arial"/>
           <w:lang w:val="es-ES" w:eastAsia="es-ES"/>
         </w:rPr>
-        <w:t xml:space="preserve"> El plazo para la ejecución del presente contrato, será por el término {{</w:t>
+        <w:t xml:space="preserve"> El plazo para la ejecución del presente contrato, será por el término </w:t>
+      </w:r>
+      <w:r>
+        <w:rPr>
+          <w:rFonts w:ascii="Arial Narrow" w:eastAsia="Times New Roman" w:hAnsi="Arial Narrow" w:cs="Arial"/>
+          <w:lang w:val="es-ES" w:eastAsia="es-ES"/>
+        </w:rPr>
+        <w:t>${</w:t>
       </w:r>
       <w:proofErr w:type="spellStart"/>
       <w:r>
@@ -755,7 +830,21 @@
           <w:rFonts w:ascii="Arial Narrow" w:eastAsia="Times New Roman" w:hAnsi="Arial Narrow" w:cs="Arial"/>
           <w:lang w:val="es-ES" w:eastAsia="es-ES"/>
         </w:rPr>
-        <w:t>}} días hábiles ({{</w:t>
+        <w:t>}</w:t>
+      </w:r>
+      <w:r>
+        <w:rPr>
+          <w:rFonts w:ascii="Arial Narrow" w:eastAsia="Times New Roman" w:hAnsi="Arial Narrow" w:cs="Arial"/>
+          <w:lang w:val="es-ES" w:eastAsia="es-ES"/>
+        </w:rPr>
+        <w:t xml:space="preserve"> días hábiles (</w:t>
+      </w:r>
+      <w:r>
+        <w:rPr>
+          <w:rFonts w:ascii="Arial Narrow" w:eastAsia="Times New Roman" w:hAnsi="Arial Narrow" w:cs="Arial"/>
+          <w:lang w:val="es-ES" w:eastAsia="es-ES"/>
+        </w:rPr>
+        <w:t>${</w:t>
       </w:r>
       <w:proofErr w:type="spellStart"/>
       <w:r>
@@ -771,7 +860,21 @@
           <w:rFonts w:ascii="Arial Narrow" w:eastAsia="Times New Roman" w:hAnsi="Arial Narrow" w:cs="Arial"/>
           <w:lang w:val="es-ES" w:eastAsia="es-ES"/>
         </w:rPr>
-        <w:t>}}) {{</w:t>
+        <w:t>}</w:t>
+      </w:r>
+      <w:r>
+        <w:rPr>
+          <w:rFonts w:ascii="Arial Narrow" w:eastAsia="Times New Roman" w:hAnsi="Arial Narrow" w:cs="Arial"/>
+          <w:lang w:val="es-ES" w:eastAsia="es-ES"/>
+        </w:rPr>
+        <w:t xml:space="preserve">) </w:t>
+      </w:r>
+      <w:r>
+        <w:rPr>
+          <w:rFonts w:ascii="Arial Narrow" w:eastAsia="Times New Roman" w:hAnsi="Arial Narrow" w:cs="Arial"/>
+          <w:lang w:val="es-ES" w:eastAsia="es-ES"/>
+        </w:rPr>
+        <w:t>${</w:t>
       </w:r>
       <w:proofErr w:type="spellStart"/>
       <w:r>
@@ -782,12 +885,28 @@
         <w:t>tx_meses_proye</w:t>
       </w:r>
       <w:proofErr w:type="spellEnd"/>
-      <w:r>
-        <w:rPr>
-          <w:rFonts w:ascii="Arial Narrow" w:eastAsia="Times New Roman" w:hAnsi="Arial Narrow" w:cs="Arial"/>
-          <w:lang w:val="es-ES" w:eastAsia="es-ES"/>
-        </w:rPr>
-        <w:t xml:space="preserve">}} ,manifestando igualmente que dependerá de la aceptación del diseño por parte de EL CONTRATANTE. En este caso, solo cuando se acepte por parte de EL CONTRATANTE el diseño y sus modificaciones, se entenderá que deberá iniciar la obra. Sin embargo, expone EL CONTRATANTE que, si aquel realiza el primer pago dispuesto en la cláusula siguiente de manera tardía a la fecha de inicio de obra, el término se entenderá dispuesto desde la fecha de pago. </w:t>
+      <w:proofErr w:type="gramStart"/>
+      <w:r>
+        <w:rPr>
+          <w:rFonts w:ascii="Arial Narrow" w:eastAsia="Times New Roman" w:hAnsi="Arial Narrow" w:cs="Arial"/>
+          <w:lang w:val="es-ES" w:eastAsia="es-ES"/>
+        </w:rPr>
+        <w:t>}</w:t>
+      </w:r>
+      <w:r>
+        <w:rPr>
+          <w:rFonts w:ascii="Arial Narrow" w:eastAsia="Times New Roman" w:hAnsi="Arial Narrow" w:cs="Arial"/>
+          <w:lang w:val="es-ES" w:eastAsia="es-ES"/>
+        </w:rPr>
+        <w:t xml:space="preserve"> ,manifestando</w:t>
+      </w:r>
+      <w:proofErr w:type="gramEnd"/>
+      <w:r>
+        <w:rPr>
+          <w:rFonts w:ascii="Arial Narrow" w:eastAsia="Times New Roman" w:hAnsi="Arial Narrow" w:cs="Arial"/>
+          <w:lang w:val="es-ES" w:eastAsia="es-ES"/>
+        </w:rPr>
+        <w:t xml:space="preserve"> igualmente que dependerá de la aceptación del diseño por parte de EL CONTRATANTE. En este caso, solo cuando se acepte por parte de EL CONTRATANTE el diseño y sus modificaciones, se entenderá que deberá iniciar la obra. Sin embargo, expone EL CONTRATANTE que, si aquel realiza el primer pago dispuesto en la cláusula siguiente de manera tardía a la fecha de inicio de obra, el término se entenderá dispuesto desde la fecha de pago. </w:t>
       </w:r>
       <w:r>
         <w:rPr>
@@ -907,7 +1026,7 @@
           <w:b/>
           <w:lang w:val="es-ES" w:eastAsia="es-ES"/>
         </w:rPr>
-        <w:t>{{</w:t>
+        <w:t>${</w:t>
       </w:r>
       <w:proofErr w:type="spellStart"/>
       <w:r>
@@ -925,7 +1044,33 @@
           <w:b/>
           <w:lang w:val="es-ES" w:eastAsia="es-ES"/>
         </w:rPr>
-        <w:t>}} PESOS  M/</w:t>
+        <w:t>}</w:t>
+      </w:r>
+      <w:r>
+        <w:rPr>
+          <w:rFonts w:ascii="Arial Narrow" w:eastAsia="Times New Roman" w:hAnsi="Arial Narrow" w:cs="Arial"/>
+          <w:b/>
+          <w:lang w:val="es-ES" w:eastAsia="es-ES"/>
+        </w:rPr>
+        <w:t xml:space="preserve"> </w:t>
+      </w:r>
+      <w:proofErr w:type="gramStart"/>
+      <w:r>
+        <w:rPr>
+          <w:rFonts w:ascii="Arial Narrow" w:eastAsia="Times New Roman" w:hAnsi="Arial Narrow" w:cs="Arial"/>
+          <w:b/>
+          <w:lang w:val="es-ES" w:eastAsia="es-ES"/>
+        </w:rPr>
+        <w:t>PESOS  M</w:t>
+      </w:r>
+      <w:proofErr w:type="gramEnd"/>
+      <w:r>
+        <w:rPr>
+          <w:rFonts w:ascii="Arial Narrow" w:eastAsia="Times New Roman" w:hAnsi="Arial Narrow" w:cs="Arial"/>
+          <w:b/>
+          <w:lang w:val="es-ES" w:eastAsia="es-ES"/>
+        </w:rPr>
+        <w:t>/</w:t>
       </w:r>
       <w:r>
         <w:rPr>
@@ -961,7 +1106,7 @@
           <w:color w:val="000000"/>
           <w:lang w:val="es-ES" w:eastAsia="es-ES"/>
         </w:rPr>
-        <w:t>{{</w:t>
+        <w:t>${</w:t>
       </w:r>
       <w:proofErr w:type="spellStart"/>
       <w:r>
@@ -981,7 +1126,7 @@
           <w:color w:val="000000"/>
           <w:lang w:val="es-ES" w:eastAsia="es-ES"/>
         </w:rPr>
-        <w:t>}}</w:t>
+        <w:t>}</w:t>
       </w:r>
       <w:r>
         <w:rPr>
@@ -1050,7 +1195,43 @@
           <w:color w:val="000000"/>
           <w:lang w:eastAsia="es-CO"/>
         </w:rPr>
-        <w:t>(50%) correspondiente (${{val_term_1}})</w:t>
+        <w:t>(50%) correspondiente ($</w:t>
+      </w:r>
+      <w:r>
+        <w:rPr>
+          <w:rFonts w:ascii="Arial Narrow" w:eastAsia="Times New Roman" w:hAnsi="Arial Narrow" w:cs="Arial"/>
+          <w:b/>
+          <w:color w:val="000000"/>
+          <w:lang w:eastAsia="es-CO"/>
+        </w:rPr>
+        <w:t>${</w:t>
+      </w:r>
+      <w:r>
+        <w:rPr>
+          <w:rFonts w:ascii="Arial Narrow" w:eastAsia="Times New Roman" w:hAnsi="Arial Narrow" w:cs="Arial"/>
+          <w:b/>
+          <w:color w:val="000000"/>
+          <w:lang w:eastAsia="es-CO"/>
+        </w:rPr>
+        <w:t>val_term_1</w:t>
+      </w:r>
+      <w:r>
+        <w:rPr>
+          <w:rFonts w:ascii="Arial Narrow" w:eastAsia="Times New Roman" w:hAnsi="Arial Narrow" w:cs="Arial"/>
+          <w:b/>
+          <w:color w:val="000000"/>
+          <w:lang w:eastAsia="es-CO"/>
+        </w:rPr>
+        <w:t>}</w:t>
+      </w:r>
+      <w:r>
+        <w:rPr>
+          <w:rFonts w:ascii="Arial Narrow" w:eastAsia="Times New Roman" w:hAnsi="Arial Narrow" w:cs="Arial"/>
+          <w:b/>
+          <w:color w:val="000000"/>
+          <w:lang w:eastAsia="es-CO"/>
+        </w:rPr>
+        <w:t>)</w:t>
       </w:r>
       <w:r>
         <w:rPr>
@@ -1068,7 +1249,43 @@
           <w:color w:val="000000"/>
           <w:lang w:eastAsia="es-CO"/>
         </w:rPr>
-        <w:t>el (30%) correspondiente a (${{val_term_2}})</w:t>
+        <w:t>el (30%) correspondiente a ($</w:t>
+      </w:r>
+      <w:r>
+        <w:rPr>
+          <w:rFonts w:ascii="Arial Narrow" w:eastAsia="Times New Roman" w:hAnsi="Arial Narrow" w:cs="Arial"/>
+          <w:b/>
+          <w:color w:val="000000"/>
+          <w:lang w:eastAsia="es-CO"/>
+        </w:rPr>
+        <w:t>${</w:t>
+      </w:r>
+      <w:r>
+        <w:rPr>
+          <w:rFonts w:ascii="Arial Narrow" w:eastAsia="Times New Roman" w:hAnsi="Arial Narrow" w:cs="Arial"/>
+          <w:b/>
+          <w:color w:val="000000"/>
+          <w:lang w:eastAsia="es-CO"/>
+        </w:rPr>
+        <w:t>val_term_2</w:t>
+      </w:r>
+      <w:r>
+        <w:rPr>
+          <w:rFonts w:ascii="Arial Narrow" w:eastAsia="Times New Roman" w:hAnsi="Arial Narrow" w:cs="Arial"/>
+          <w:b/>
+          <w:color w:val="000000"/>
+          <w:lang w:eastAsia="es-CO"/>
+        </w:rPr>
+        <w:t>}</w:t>
+      </w:r>
+      <w:r>
+        <w:rPr>
+          <w:rFonts w:ascii="Arial Narrow" w:eastAsia="Times New Roman" w:hAnsi="Arial Narrow" w:cs="Arial"/>
+          <w:b/>
+          <w:color w:val="000000"/>
+          <w:lang w:eastAsia="es-CO"/>
+        </w:rPr>
+        <w:t>)</w:t>
       </w:r>
       <w:r>
         <w:rPr>
@@ -1086,7 +1303,43 @@
           <w:color w:val="000000"/>
           <w:lang w:eastAsia="es-CO"/>
         </w:rPr>
-        <w:t>15%) correspondiente a (${{val_term_3}})</w:t>
+        <w:t>15%) correspondiente a ($</w:t>
+      </w:r>
+      <w:r>
+        <w:rPr>
+          <w:rFonts w:ascii="Arial Narrow" w:eastAsia="Times New Roman" w:hAnsi="Arial Narrow" w:cs="Arial"/>
+          <w:b/>
+          <w:color w:val="000000"/>
+          <w:lang w:eastAsia="es-CO"/>
+        </w:rPr>
+        <w:t>${</w:t>
+      </w:r>
+      <w:r>
+        <w:rPr>
+          <w:rFonts w:ascii="Arial Narrow" w:eastAsia="Times New Roman" w:hAnsi="Arial Narrow" w:cs="Arial"/>
+          <w:b/>
+          <w:color w:val="000000"/>
+          <w:lang w:eastAsia="es-CO"/>
+        </w:rPr>
+        <w:t>val_term_3</w:t>
+      </w:r>
+      <w:r>
+        <w:rPr>
+          <w:rFonts w:ascii="Arial Narrow" w:eastAsia="Times New Roman" w:hAnsi="Arial Narrow" w:cs="Arial"/>
+          <w:b/>
+          <w:color w:val="000000"/>
+          <w:lang w:eastAsia="es-CO"/>
+        </w:rPr>
+        <w:t>}</w:t>
+      </w:r>
+      <w:r>
+        <w:rPr>
+          <w:rFonts w:ascii="Arial Narrow" w:eastAsia="Times New Roman" w:hAnsi="Arial Narrow" w:cs="Arial"/>
+          <w:b/>
+          <w:color w:val="000000"/>
+          <w:lang w:eastAsia="es-CO"/>
+        </w:rPr>
+        <w:t>)</w:t>
       </w:r>
       <w:r>
         <w:rPr>
@@ -1122,7 +1375,43 @@
           <w:color w:val="000000"/>
           <w:lang w:eastAsia="es-CO"/>
         </w:rPr>
-        <w:t>(3%) correspondiente (${{val_term_4}})</w:t>
+        <w:t>(3%) correspondiente ($</w:t>
+      </w:r>
+      <w:r>
+        <w:rPr>
+          <w:rFonts w:ascii="Arial Narrow" w:eastAsia="Times New Roman" w:hAnsi="Arial Narrow" w:cs="Arial"/>
+          <w:b/>
+          <w:color w:val="000000"/>
+          <w:lang w:eastAsia="es-CO"/>
+        </w:rPr>
+        <w:t>${</w:t>
+      </w:r>
+      <w:r>
+        <w:rPr>
+          <w:rFonts w:ascii="Arial Narrow" w:eastAsia="Times New Roman" w:hAnsi="Arial Narrow" w:cs="Arial"/>
+          <w:b/>
+          <w:color w:val="000000"/>
+          <w:lang w:eastAsia="es-CO"/>
+        </w:rPr>
+        <w:t>val_term_4</w:t>
+      </w:r>
+      <w:r>
+        <w:rPr>
+          <w:rFonts w:ascii="Arial Narrow" w:eastAsia="Times New Roman" w:hAnsi="Arial Narrow" w:cs="Arial"/>
+          <w:b/>
+          <w:color w:val="000000"/>
+          <w:lang w:eastAsia="es-CO"/>
+        </w:rPr>
+        <w:t>}</w:t>
+      </w:r>
+      <w:r>
+        <w:rPr>
+          <w:rFonts w:ascii="Arial Narrow" w:eastAsia="Times New Roman" w:hAnsi="Arial Narrow" w:cs="Arial"/>
+          <w:b/>
+          <w:color w:val="000000"/>
+          <w:lang w:eastAsia="es-CO"/>
+        </w:rPr>
+        <w:t>)</w:t>
       </w:r>
       <w:r>
         <w:rPr>
@@ -1131,16 +1420,52 @@
           <w:color w:val="000000"/>
           <w:lang w:eastAsia="es-CO"/>
         </w:rPr>
-        <w:t xml:space="preserve"> </w:t>
-      </w:r>
-      <w:r>
-        <w:rPr>
-          <w:rFonts w:ascii="Arial Narrow" w:eastAsia="Times New Roman" w:hAnsi="Arial Narrow" w:cs="Arial"/>
-          <w:b/>
-          <w:color w:val="000000"/>
-          <w:lang w:eastAsia="es-CO"/>
-        </w:rPr>
-        <w:t xml:space="preserve"> </w:t>
+        <w:t xml:space="preserve"> al momento que EL CONTRATISTA informe a EL CONTRATANTE que ha comenzado la instalación de accesorios, grifería y el </w:t>
+      </w:r>
+      <w:r>
+        <w:rPr>
+          <w:rFonts w:ascii="Arial Narrow" w:eastAsia="Times New Roman" w:hAnsi="Arial Narrow" w:cs="Arial"/>
+          <w:b/>
+          <w:color w:val="000000"/>
+          <w:lang w:eastAsia="es-CO"/>
+        </w:rPr>
+        <w:t>(2%) correspondiente a ($</w:t>
+      </w:r>
+      <w:r>
+        <w:rPr>
+          <w:rFonts w:ascii="Arial Narrow" w:eastAsia="Times New Roman" w:hAnsi="Arial Narrow" w:cs="Arial"/>
+          <w:b/>
+          <w:color w:val="000000"/>
+          <w:lang w:eastAsia="es-CO"/>
+        </w:rPr>
+        <w:t>${</w:t>
+      </w:r>
+      <w:r>
+        <w:rPr>
+          <w:rFonts w:ascii="Arial Narrow" w:eastAsia="Times New Roman" w:hAnsi="Arial Narrow" w:cs="Arial"/>
+          <w:b/>
+          <w:color w:val="000000"/>
+          <w:lang w:eastAsia="es-CO"/>
+        </w:rPr>
+        <w:t>val_term_5</w:t>
+      </w:r>
+      <w:r>
+        <w:rPr>
+          <w:rFonts w:ascii="Arial Narrow" w:eastAsia="Times New Roman" w:hAnsi="Arial Narrow" w:cs="Arial"/>
+          <w:b/>
+          <w:color w:val="000000"/>
+          <w:lang w:eastAsia="es-CO"/>
+        </w:rPr>
+        <w:t>}</w:t>
+      </w:r>
+      <w:r>
+        <w:rPr>
+          <w:rFonts w:ascii="Arial Narrow" w:eastAsia="Times New Roman" w:hAnsi="Arial Narrow" w:cs="Arial"/>
+          <w:b/>
+          <w:color w:val="000000"/>
+          <w:lang w:eastAsia="es-CO"/>
+        </w:rPr>
+        <w:t xml:space="preserve">) </w:t>
       </w:r>
       <w:r>
         <w:rPr>
@@ -1149,16 +1474,16 @@
           <w:color w:val="000000"/>
           <w:lang w:eastAsia="es-CO"/>
         </w:rPr>
-        <w:t xml:space="preserve">al momento que EL CONTRATISTA informe a EL CONTRATANTE que ha comenzado la instalación de accesorios, grifería y el </w:t>
-      </w:r>
-      <w:r>
-        <w:rPr>
-          <w:rFonts w:ascii="Arial Narrow" w:eastAsia="Times New Roman" w:hAnsi="Arial Narrow" w:cs="Arial"/>
-          <w:b/>
-          <w:color w:val="000000"/>
-          <w:lang w:eastAsia="es-CO"/>
-        </w:rPr>
-        <w:t xml:space="preserve">(2%) correspondiente a (${{val_term_5}}) </w:t>
+        <w:t xml:space="preserve">al momento que EL CONTRATISTA informe a EL CONTRATANTE que hará entrega de la obra. </w:t>
+      </w:r>
+      <w:r>
+        <w:rPr>
+          <w:rFonts w:ascii="Arial Narrow" w:eastAsia="Times New Roman" w:hAnsi="Arial Narrow" w:cs="Arial"/>
+          <w:b/>
+          <w:color w:val="000000"/>
+          <w:lang w:eastAsia="es-CO"/>
+        </w:rPr>
+        <w:t xml:space="preserve">Parágrafo primero: </w:t>
       </w:r>
       <w:r>
         <w:rPr>
@@ -1167,16 +1492,16 @@
           <w:color w:val="000000"/>
           <w:lang w:eastAsia="es-CO"/>
         </w:rPr>
-        <w:t xml:space="preserve">al momento que EL CONTRATISTA informe a EL CONTRATANTE que hará entrega de la obra. </w:t>
-      </w:r>
-      <w:r>
-        <w:rPr>
-          <w:rFonts w:ascii="Arial Narrow" w:eastAsia="Times New Roman" w:hAnsi="Arial Narrow" w:cs="Arial"/>
-          <w:b/>
-          <w:color w:val="000000"/>
-          <w:lang w:eastAsia="es-CO"/>
-        </w:rPr>
-        <w:t xml:space="preserve">Parágrafo primero: </w:t>
+        <w:t xml:space="preserve">EL CONTRATISTA no iniciará la obra hasta que EL CONTRATANTE no demuestre que ha realizado el primer pago correspondiente al CINCUENTA POR CIENTO (50%) de la obra. </w:t>
+      </w:r>
+      <w:r>
+        <w:rPr>
+          <w:rFonts w:ascii="Arial Narrow" w:eastAsia="Times New Roman" w:hAnsi="Arial Narrow" w:cs="Arial"/>
+          <w:b/>
+          <w:color w:val="000000"/>
+          <w:lang w:eastAsia="es-CO"/>
+        </w:rPr>
+        <w:t xml:space="preserve">Parágrafo segundo: </w:t>
       </w:r>
       <w:r>
         <w:rPr>
@@ -1185,7 +1510,7 @@
           <w:color w:val="000000"/>
           <w:lang w:eastAsia="es-CO"/>
         </w:rPr>
-        <w:t xml:space="preserve">EL CONTRATISTA no iniciará la obra hasta que EL CONTRATANTE no demuestre que ha </w:t>
+        <w:t xml:space="preserve">EL CONTRATISTA podrá suspender la obra si EL CONTRATANTE no realiza los pagos al </w:t>
       </w:r>
       <w:r>
         <w:rPr>
@@ -1195,25 +1520,7 @@
           <w:lang w:eastAsia="es-CO"/>
         </w:rPr>
         <w:lastRenderedPageBreak/>
-        <w:t xml:space="preserve">realizado el primer pago correspondiente al CINCUENTA POR CIENTO (50%) de la obra. </w:t>
-      </w:r>
-      <w:r>
-        <w:rPr>
-          <w:rFonts w:ascii="Arial Narrow" w:eastAsia="Times New Roman" w:hAnsi="Arial Narrow" w:cs="Arial"/>
-          <w:b/>
-          <w:color w:val="000000"/>
-          <w:lang w:eastAsia="es-CO"/>
-        </w:rPr>
-        <w:t xml:space="preserve">Parágrafo segundo: </w:t>
-      </w:r>
-      <w:r>
-        <w:rPr>
-          <w:rFonts w:ascii="Arial Narrow" w:eastAsia="Times New Roman" w:hAnsi="Arial Narrow" w:cs="Arial"/>
-          <w:bCs/>
-          <w:color w:val="000000"/>
-          <w:lang w:eastAsia="es-CO"/>
-        </w:rPr>
-        <w:t xml:space="preserve">EL CONTRATISTA podrá suspender la obra si EL CONTRATANTE no realiza los pagos al momento de notificar a aquel que debe realizar los mismos conforme lo estipulado en esta cláusula. </w:t>
+        <w:t xml:space="preserve">momento de notificar a aquel que debe realizar los mismos conforme lo estipulado en esta cláusula. </w:t>
       </w:r>
       <w:r>
         <w:rPr>
@@ -1557,7 +1864,7 @@
           <w:rFonts w:ascii="Arial Narrow" w:eastAsia="Times New Roman" w:hAnsi="Arial Narrow" w:cs="Arial"/>
           <w:lang w:val="es-ES" w:eastAsia="es-ES"/>
         </w:rPr>
-        <w:t xml:space="preserve">EL CONTRATANTE se obliga a cubrir los gastos de energía que realicen las maquinas o elementos de trabajo que use EL CONTRATISTA para el desarrollo adecuado del contrato, manifestando que dichos costos se cargarán en efecto al recibo de servicios públicos de EL CONTRATANTE y serán asumidos en su totalidad por él, manifestando EL CONTRATANTE que desde ahora asume los mencionados pagos y desobliga a EL CONTRATISTA de ello. Igualmente, EL CONTRATANTE se obliga a dejar autorización previa para la visita de </w:t>
+        <w:t xml:space="preserve">EL CONTRATANTE se obliga a cubrir los gastos de energía que realicen las maquinas o elementos de trabajo que use EL CONTRATISTA para el desarrollo adecuado del contrato, manifestando que dichos costos se cargarán en efecto al recibo de servicios públicos de EL CONTRATANTE y serán asumidos en su totalidad por él, manifestando EL CONTRATANTE que desde ahora asume los mencionados pagos y desobliga a EL CONTRATISTA de ello. Igualmente, EL CONTRATANTE se obliga a dejar autorización previa para la visita de EL CONTRATISTA durante el término de ejecución de la obra, en caso de incumplimiento en ello, que impida la ejecución por parte de EL CONTRATISTA, desde ahora EL CONTRATANTE asume la responsabilidad y </w:t>
       </w:r>
       <w:r>
         <w:rPr>
@@ -1565,7 +1872,7 @@
           <w:lang w:val="es-ES" w:eastAsia="es-ES"/>
         </w:rPr>
         <w:lastRenderedPageBreak/>
-        <w:t xml:space="preserve">EL CONTRATISTA durante el término de ejecución de la obra, en caso de incumplimiento en ello, que impida la ejecución por parte de EL CONTRATISTA, desde ahora EL CONTRATANTE asume la responsabilidad y autoriza expresamente que se suspenda la obra en el término que dure sin ingresar al inmueble de objeto de la misma, pudiendo EL CONTRATISTA retrasar la obra, para lo cual EL CONTRATANTE lo autoriza anticipadamente. </w:t>
+        <w:t xml:space="preserve">autoriza expresamente que se suspenda la obra en el término que dure sin ingresar al inmueble de objeto de la misma, pudiendo EL CONTRATISTA retrasar la obra, para lo cual EL CONTRATANTE lo autoriza anticipadamente. </w:t>
       </w:r>
       <w:r>
         <w:rPr>
@@ -1668,7 +1975,7 @@
                 <w:rFonts w:ascii="Arial Narrow" w:eastAsia="Calibri" w:hAnsi="Arial Narrow"/>
                 <w:b/>
               </w:rPr>
-              <w:t>{{</w:t>
+              <w:t>${</w:t>
             </w:r>
             <w:proofErr w:type="spellStart"/>
             <w:r>
@@ -1684,7 +1991,7 @@
                 <w:rFonts w:ascii="Arial Narrow" w:eastAsia="Calibri" w:hAnsi="Arial Narrow"/>
                 <w:b/>
               </w:rPr>
-              <w:t>}}</w:t>
+              <w:t>}</w:t>
             </w:r>
           </w:p>
           <w:p>
@@ -1699,7 +2006,7 @@
                 <w:rFonts w:ascii="Arial Narrow" w:eastAsia="Times New Roman" w:hAnsi="Arial Narrow" w:cs="Arial"/>
                 <w:lang w:val="es-ES" w:eastAsia="es-ES"/>
               </w:rPr>
-              <w:t>{{</w:t>
+              <w:t>${</w:t>
             </w:r>
             <w:proofErr w:type="spellStart"/>
             <w:r>
@@ -1715,7 +2022,14 @@
                 <w:rFonts w:ascii="Arial Narrow" w:eastAsia="Times New Roman" w:hAnsi="Arial Narrow" w:cs="Arial"/>
                 <w:lang w:val="es-ES" w:eastAsia="es-ES"/>
               </w:rPr>
-              <w:t xml:space="preserve">}} </w:t>
+              <w:t>}</w:t>
+            </w:r>
+            <w:r>
+              <w:rPr>
+                <w:rFonts w:ascii="Arial Narrow" w:eastAsia="Times New Roman" w:hAnsi="Arial Narrow" w:cs="Arial"/>
+                <w:lang w:val="es-ES" w:eastAsia="es-ES"/>
+              </w:rPr>
+              <w:t xml:space="preserve"> </w:t>
             </w:r>
             <w:proofErr w:type="spellStart"/>
             <w:r>
@@ -1739,7 +2053,7 @@
                 <w:b/>
                 <w:lang w:val="es-ES_tradnl"/>
               </w:rPr>
-              <w:t>{{</w:t>
+              <w:t>${</w:t>
             </w:r>
             <w:proofErr w:type="spellStart"/>
             <w:r>
@@ -1757,7 +2071,7 @@
                 <w:b/>
                 <w:lang w:val="es-ES_tradnl"/>
               </w:rPr>
-              <w:t>}}</w:t>
+              <w:t>}</w:t>
             </w:r>
           </w:p>
         </w:tc>
@@ -1806,7 +2120,7 @@
                 <w:bCs/>
                 <w:lang w:val="es-ES" w:eastAsia="es-ES"/>
               </w:rPr>
-              <w:t>{{</w:t>
+              <w:t>${</w:t>
             </w:r>
             <w:proofErr w:type="spellStart"/>
             <w:r>
@@ -1826,7 +2140,7 @@
                 <w:bCs/>
                 <w:lang w:val="es-ES" w:eastAsia="es-ES"/>
               </w:rPr>
-              <w:t>}}</w:t>
+              <w:t>}</w:t>
             </w:r>
           </w:p>
           <w:p>
@@ -1843,7 +2157,7 @@
                 <w:bCs/>
                 <w:lang w:val="es-ES" w:eastAsia="es-ES"/>
               </w:rPr>
-              <w:t>{{</w:t>
+              <w:t>${</w:t>
             </w:r>
             <w:proofErr w:type="spellStart"/>
             <w:r>
@@ -1863,7 +2177,7 @@
                 <w:bCs/>
                 <w:lang w:val="es-ES" w:eastAsia="es-ES"/>
               </w:rPr>
-              <w:t>}}</w:t>
+              <w:t>}</w:t>
             </w:r>
             <w:r>
               <w:rPr>
@@ -1895,7 +2209,7 @@
                 <w:bCs/>
                 <w:lang w:val="es-ES" w:eastAsia="es-ES"/>
               </w:rPr>
-              <w:t>{{</w:t>
+              <w:t>${</w:t>
             </w:r>
             <w:proofErr w:type="spellStart"/>
             <w:r>
@@ -1915,7 +2229,7 @@
                 <w:bCs/>
                 <w:lang w:val="es-ES" w:eastAsia="es-ES"/>
               </w:rPr>
-              <w:t>}}</w:t>
+              <w:t>}</w:t>
             </w:r>
             <w:r>
               <w:rPr>
@@ -1928,7 +2242,14 @@
                 <w:rFonts w:ascii="Arial Narrow" w:eastAsia="Times New Roman" w:hAnsi="Arial Narrow" w:cs="Arial"/>
                 <w:lang w:val="es-ES" w:eastAsia="es-ES"/>
               </w:rPr>
-              <w:t>expedida en {{</w:t>
+              <w:t xml:space="preserve">expedida en </w:t>
+            </w:r>
+            <w:r>
+              <w:rPr>
+                <w:rFonts w:ascii="Arial Narrow" w:eastAsia="Times New Roman" w:hAnsi="Arial Narrow" w:cs="Arial"/>
+                <w:lang w:val="es-ES" w:eastAsia="es-ES"/>
+              </w:rPr>
+              <w:t>${</w:t>
             </w:r>
             <w:proofErr w:type="spellStart"/>
             <w:r>
@@ -1944,7 +2265,7 @@
                 <w:rFonts w:ascii="Arial Narrow" w:eastAsia="Times New Roman" w:hAnsi="Arial Narrow" w:cs="Arial"/>
                 <w:lang w:val="es-ES" w:eastAsia="es-ES"/>
               </w:rPr>
-              <w:t>}}</w:t>
+              <w:t>}</w:t>
             </w:r>
           </w:p>
           <w:p>
@@ -1976,8 +2297,9 @@
                 <w:b/>
                 <w:bCs/>
               </w:rPr>
-              <w:t>{</w:t>
+              <w:t>${</w:t>
             </w:r>
+            <w:proofErr w:type="spellStart"/>
             <w:r>
               <w:rPr>
                 <w:rFonts w:ascii="Arial Narrow" w:eastAsia="Times New Roman" w:hAnsi="Arial Narrow" w:cs="Arial"/>
@@ -1985,9 +2307,9 @@
                 <w:bCs/>
                 <w:lang w:val="es-ES" w:eastAsia="es-ES"/>
               </w:rPr>
-              <w:t>{</w:t>
+              <w:t>razon_social</w:t>
             </w:r>
-            <w:proofErr w:type="spellStart"/>
+            <w:proofErr w:type="spellEnd"/>
             <w:r>
               <w:rPr>
                 <w:rFonts w:ascii="Arial Narrow" w:eastAsia="Times New Roman" w:hAnsi="Arial Narrow" w:cs="Arial"/>
@@ -1995,17 +2317,7 @@
                 <w:bCs/>
                 <w:lang w:val="es-ES" w:eastAsia="es-ES"/>
               </w:rPr>
-              <w:t>razon_social</w:t>
-            </w:r>
-            <w:proofErr w:type="spellEnd"/>
-            <w:r>
-              <w:rPr>
-                <w:rFonts w:ascii="Arial Narrow" w:eastAsia="Times New Roman" w:hAnsi="Arial Narrow" w:cs="Arial"/>
-                <w:b/>
-                <w:bCs/>
-                <w:lang w:val="es-ES" w:eastAsia="es-ES"/>
-              </w:rPr>
-              <w:t>}}</w:t>
+              <w:t>}</w:t>
             </w:r>
           </w:p>
           <w:p>

</xml_diff>